<commit_message>
Match rate suggestions to pricing-rule conditions and price only the latest buy and sell ratings.
Profit stays empty when one side or the reporting FX rate is missing. Each side keeps its own chargeable quantity.

Co-authored-by: Cursor <cursoragent@cursor.com>
</commit_message>
<xml_diff>
--- a/docs/po/12102026/LCMS_Consolidated_Change_Request_DEV_2026-10-12_v1.0_DEV_Response.docx
+++ b/docs/po/12102026/LCMS_Consolidated_Change_Request_DEV_2026-10-12_v1.0_DEV_Response.docx
@@ -403,6 +403,62 @@
         <w:t>Đặc tả gốc không bị sửa.</w:t>
       </w:r>
     </w:p>
+    <w:p>
+      <w:pPr>
+        <w:pStyle w:val="Heading1"/>
+      </w:pPr>
+      <w:r>
+        <w:t>8. Bổ sung sau rà soát</w:t>
+      </w:r>
+    </w:p>
+    <w:p>
+      <w:pPr>
+        <w:pStyle w:val="ListBullet"/>
+      </w:pPr>
+      <w:r>
+        <w:t>Đề xuất bảng giá so khớp tuyến trên quy tắc giá, cùng chỗ engine đang so. Bảng giá không ghi tuyến nhưng quy tắc sai tuyến thì không được chọn.</w:t>
+      </w:r>
+    </w:p>
+    <w:p>
+      <w:pPr>
+        <w:pStyle w:val="ListBullet"/>
+      </w:pPr>
+      <w:r>
+        <w:t>Lợi nhuận dự kiến lấy hai lần tính giá mới nhất, BUY và SELL, rồi quy đổi sang tiền tệ báo cáo. Không cộng các dòng chi phí hoặc doanh thu khác của Bill. Thiếu tỷ giá thì không có số lợi nhuận.</w:t>
+      </w:r>
+    </w:p>
+    <w:p>
+      <w:pPr>
+        <w:pStyle w:val="ListBullet"/>
+      </w:pPr>
+      <w:r>
+        <w:t>Mỗi chiều có ô khối lượng và trọng lượng riêng.</w:t>
+      </w:r>
+    </w:p>
+    <w:p>
+      <w:pPr>
+        <w:pStyle w:val="ListBullet"/>
+      </w:pPr>
+      <w:r>
+        <w:t>Test API trên SQLite: Suggestion_UsesRuleRoute_AndRetiredCardCannotRate Pass; Margin_IsBuySellRatingsOnly_AndHidesProfitWhenFxIsMissing Pass. Test đơn vị BillRateSuggestionTests Pass.</w:t>
+      </w:r>
+    </w:p>
+    <w:p>
+      <w:pPr>
+        <w:pStyle w:val="ListBullet"/>
+      </w:pPr>
+      <w:r>
+        <w:t>Đã đọc form tạo Bill. Dòng kiện và container trống thì được bỏ qua, không bắt buộc cả hai, không suy ra container từ kiện. Chưa có bước đối chiếu tổng dòng với tổng Bill. ADR-0024 vẫn nói màn tạo không có lưới, trong khi form hiện tại có lưới. BILL-PKG-01 tiếp tục HOLD.</w:t>
+      </w:r>
+    </w:p>
+    <w:p>
+      <w:pPr>
+        <w:pStyle w:val="ListBullet"/>
+      </w:pPr>
+      <w:r>
+        <w:t>Vẫn chưa có ảnh trình duyệt trên site đang chạy. Các AC thuần giao diện chưa được ghi Đạt nghiệm thu.</w:t>
+      </w:r>
+    </w:p>
     <w:sectPr>
       <w:pgSz w:w="12240" w:h="15840"/>
       <w:pgMar w:top="1440" w:right="1800" w:bottom="1440" w:left="1800" w:header="720" w:footer="720" w:gutter="0"/>

</xml_diff>

<commit_message>
Hide expected rating margin unless the user can read both cost and revenue.
A cost-only accountant no longer receives the sell rating or a profit figure.

Co-authored-by: Cursor <cursoragent@cursor.com>
</commit_message>
<xml_diff>
--- a/docs/po/12102026/LCMS_Consolidated_Change_Request_DEV_2026-10-12_v1.0_DEV_Response.docx
+++ b/docs/po/12102026/LCMS_Consolidated_Change_Request_DEV_2026-10-12_v1.0_DEV_Response.docx
@@ -459,6 +459,14 @@
         <w:t>Vẫn chưa có ảnh trình duyệt trên site đang chạy. Các AC thuần giao diện chưa được ghi Đạt nghiệm thu.</w:t>
       </w:r>
     </w:p>
+    <w:p>
+      <w:pPr>
+        <w:pStyle w:val="ListBullet"/>
+      </w:pPr>
+      <w:r>
+        <w:t>Lợi nhuận dự kiến chỉ trả khi người dùng có cả quyền xem chi phí và quyền xem doanh thu. Kế toán chi phí mở lịch sử tính giá không thấy chiều bán. Test API CostAccountant_DoesNotSeeSellRatingOrProfit Pass. Site https://cms.lsslogistics.vn yêu cầu đăng nhập; máy này không có tài khoản ứng dụng nên chưa chụp được màn hình nghiệm thu.</w:t>
+      </w:r>
+    </w:p>
     <w:sectPr>
       <w:pgSz w:w="12240" w:h="15840"/>
       <w:pgMar w:top="1440" w:right="1800" w:bottom="1440" w:left="1800" w:header="720" w:footer="720" w:gutter="0"/>

</xml_diff>

<commit_message>
Keep Bill create on totals only, per the locked ADR-0024 decision.
An air bill saves without package lines, and a blank package count is not stored as one piece.

Co-authored-by: Cursor <cursoragent@cursor.com>
</commit_message>
<xml_diff>
--- a/docs/po/12102026/LCMS_Consolidated_Change_Request_DEV_2026-10-12_v1.0_DEV_Response.docx
+++ b/docs/po/12102026/LCMS_Consolidated_Change_Request_DEV_2026-10-12_v1.0_DEV_Response.docx
@@ -467,6 +467,46 @@
         <w:t>Lợi nhuận dự kiến chỉ trả khi người dùng có cả quyền xem chi phí và quyền xem doanh thu. Kế toán chi phí mở lịch sử tính giá không thấy chiều bán. Test API CostAccountant_DoesNotSeeSellRatingOrProfit Pass. Site https://cms.lsslogistics.vn yêu cầu đăng nhập; máy này không có tài khoản ứng dụng nên chưa chụp được màn hình nghiệm thu.</w:t>
       </w:r>
     </w:p>
+    <w:p>
+      <w:pPr>
+        <w:pStyle w:val="Heading1"/>
+      </w:pPr>
+      <w:r>
+        <w:t>9. BILL-PKG-01 theo phương án PO đã chốt</w:t>
+      </w:r>
+    </w:p>
+    <w:p>
+      <w:pPr>
+        <w:pStyle w:val="ListBullet"/>
+      </w:pPr>
+      <w:r>
+        <w:t>PO chọn phương án 1 theo ADR-0024. Màn tạo Bill chỉ nhập số tổng. Lưới kiện và container đã bỏ khỏi màn này. Màn tạo Order không đổi.</w:t>
+      </w:r>
+    </w:p>
+    <w:p>
+      <w:pPr>
+        <w:pStyle w:val="ListBullet"/>
+      </w:pPr>
+      <w:r>
+        <w:t>Bill AIR không khai báo kiện vẫn lưu. Số kiện để trống thì không ghi thành 1 kiện trên vận đơn tạo kèm.</w:t>
+      </w:r>
+    </w:p>
+    <w:p>
+      <w:pPr>
+        <w:pStyle w:val="ListBullet"/>
+      </w:pPr>
+      <w:r>
+        <w:t>Trọng lượng và thể tích đã nhập được lưu trên Bill và là đầu vào tính giá. Không thêm bước đối chiếu tổng dòng kiện. Không đổi cách xác định trọng lượng tính cước và các kiểm soát Rating đã chốt.</w:t>
+      </w:r>
+    </w:p>
+    <w:p>
+      <w:pPr>
+        <w:pStyle w:val="ListBullet"/>
+      </w:pPr>
+      <w:r>
+        <w:t>Test BillCreateTotalsTests Pass, gồm Air_bill_saves_without_package_lines_and_keeps_entered_totals và Bill_create_screen_keeps_totals_and_hides_piece_grid. Ảnh màn tạo trên site đang chạy vẫn cần tài khoản đăng nhập.</w:t>
+      </w:r>
+    </w:p>
     <w:sectPr>
       <w:pgSz w:w="12240" w:h="15840"/>
       <w:pgMar w:top="1440" w:right="1800" w:bottom="1440" w:left="1800" w:header="720" w:footer="720" w:gutter="0"/>

</xml_diff>